<commit_message>
Give each chapter its own centered title page and refresh TOC page numbers
Co-Authored-By: Claude Opus 5.5 <noreply@anthropic.com>
Claude-Session: https://claude.ai/code/session_01VvsFLnUiGGa5nBsdDp7PHL
</commit_message>
<xml_diff>
--- a/DDH_Graduation_Project_Formatted.docx
+++ b/DDH_Graduation_Project_Formatted.docx
@@ -84,7 +84,7 @@
             <w:tab/>
           </w:r>
           <w:r>
-            <w:t>1</w:t>
+            <w:t>2</w:t>
           </w:r>
         </w:p>
         <w:p>
@@ -98,7 +98,7 @@
             <w:tab/>
           </w:r>
           <w:r>
-            <w:t>2</w:t>
+            <w:t>3</w:t>
           </w:r>
         </w:p>
         <w:p>
@@ -112,7 +112,7 @@
             <w:tab/>
           </w:r>
           <w:r>
-            <w:t>3</w:t>
+            <w:t>4</w:t>
           </w:r>
         </w:p>
         <w:p>
@@ -126,7 +126,7 @@
             <w:tab/>
           </w:r>
           <w:r>
-            <w:t>4</w:t>
+            <w:t>5</w:t>
           </w:r>
         </w:p>
         <w:p>
@@ -140,7 +140,7 @@
             <w:tab/>
           </w:r>
           <w:r>
-            <w:t>5</w:t>
+            <w:t>6</w:t>
           </w:r>
         </w:p>
         <w:p>
@@ -154,7 +154,7 @@
             <w:tab/>
           </w:r>
           <w:r>
-            <w:t>5</w:t>
+            <w:t>6</w:t>
           </w:r>
         </w:p>
         <w:p>
@@ -168,7 +168,7 @@
             <w:tab/>
           </w:r>
           <w:r>
-            <w:t>5</w:t>
+            <w:t>6</w:t>
           </w:r>
         </w:p>
         <w:p>
@@ -182,7 +182,7 @@
             <w:tab/>
           </w:r>
           <w:r>
-            <w:t>6</w:t>
+            <w:t>7</w:t>
           </w:r>
         </w:p>
         <w:p>
@@ -196,7 +196,7 @@
             <w:tab/>
           </w:r>
           <w:r>
-            <w:t>7</w:t>
+            <w:t>8</w:t>
           </w:r>
         </w:p>
         <w:p>
@@ -210,7 +210,7 @@
             <w:tab/>
           </w:r>
           <w:r>
-            <w:t>9</w:t>
+            <w:t>10</w:t>
           </w:r>
         </w:p>
         <w:p>
@@ -224,7 +224,7 @@
             <w:tab/>
           </w:r>
           <w:r>
-            <w:t>9</w:t>
+            <w:t>11</w:t>
           </w:r>
         </w:p>
         <w:p>
@@ -238,7 +238,7 @@
             <w:tab/>
           </w:r>
           <w:r>
-            <w:t>10</w:t>
+            <w:t>12</w:t>
           </w:r>
         </w:p>
         <w:p>
@@ -252,7 +252,7 @@
             <w:tab/>
           </w:r>
           <w:r>
-            <w:t>11</w:t>
+            <w:t>13</w:t>
           </w:r>
         </w:p>
         <w:p>
@@ -266,7 +266,7 @@
             <w:tab/>
           </w:r>
           <w:r>
-            <w:t>12</w:t>
+            <w:t>14</w:t>
           </w:r>
         </w:p>
         <w:p>
@@ -280,7 +280,7 @@
             <w:tab/>
           </w:r>
           <w:r>
-            <w:t>15</w:t>
+            <w:t>16</w:t>
           </w:r>
         </w:p>
         <w:p>
@@ -294,7 +294,7 @@
             <w:tab/>
           </w:r>
           <w:r>
-            <w:t>15</w:t>
+            <w:t>17</w:t>
           </w:r>
         </w:p>
         <w:p>
@@ -308,7 +308,7 @@
             <w:tab/>
           </w:r>
           <w:r>
-            <w:t>16</w:t>
+            <w:t>18</w:t>
           </w:r>
         </w:p>
         <w:p>
@@ -322,7 +322,7 @@
             <w:tab/>
           </w:r>
           <w:r>
-            <w:t>18</w:t>
+            <w:t>19</w:t>
           </w:r>
         </w:p>
         <w:p>
@@ -336,7 +336,7 @@
             <w:tab/>
           </w:r>
           <w:r>
-            <w:t>19</w:t>
+            <w:t>21</w:t>
           </w:r>
         </w:p>
         <w:p>
@@ -350,7 +350,7 @@
             <w:tab/>
           </w:r>
           <w:r>
-            <w:t>21</w:t>
+            <w:t>23</w:t>
           </w:r>
         </w:p>
         <w:p>
@@ -364,7 +364,7 @@
             <w:tab/>
           </w:r>
           <w:r>
-            <w:t>24</w:t>
+            <w:t>26</w:t>
           </w:r>
         </w:p>
         <w:p>
@@ -378,7 +378,7 @@
             <w:tab/>
           </w:r>
           <w:r>
-            <w:t>24</w:t>
+            <w:t>27</w:t>
           </w:r>
         </w:p>
         <w:p>
@@ -392,7 +392,7 @@
             <w:tab/>
           </w:r>
           <w:r>
-            <w:t>24</w:t>
+            <w:t>27</w:t>
           </w:r>
         </w:p>
         <w:p>
@@ -406,7 +406,7 @@
             <w:tab/>
           </w:r>
           <w:r>
-            <w:t>24</w:t>
+            <w:t>27</w:t>
           </w:r>
         </w:p>
         <w:p>
@@ -420,7 +420,7 @@
             <w:tab/>
           </w:r>
           <w:r>
-            <w:t>25</w:t>
+            <w:t>28</w:t>
           </w:r>
         </w:p>
         <w:p>
@@ -434,7 +434,7 @@
             <w:tab/>
           </w:r>
           <w:r>
-            <w:t>26</w:t>
+            <w:t>29</w:t>
           </w:r>
         </w:p>
         <w:p>
@@ -448,7 +448,7 @@
             <w:tab/>
           </w:r>
           <w:r>
-            <w:t>26</w:t>
+            <w:t>29</w:t>
           </w:r>
         </w:p>
         <w:p>
@@ -462,7 +462,7 @@
             <w:tab/>
           </w:r>
           <w:r>
-            <w:t>27</w:t>
+            <w:t>30</w:t>
           </w:r>
         </w:p>
         <w:p>
@@ -476,7 +476,7 @@
             <w:tab/>
           </w:r>
           <w:r>
-            <w:t>29</w:t>
+            <w:t>32</w:t>
           </w:r>
         </w:p>
         <w:p>
@@ -490,7 +490,7 @@
             <w:tab/>
           </w:r>
           <w:r>
-            <w:t>29</w:t>
+            <w:t>33</w:t>
           </w:r>
         </w:p>
         <w:p>
@@ -504,7 +504,7 @@
             <w:tab/>
           </w:r>
           <w:r>
-            <w:t>29</w:t>
+            <w:t>33</w:t>
           </w:r>
         </w:p>
         <w:p>
@@ -518,7 +518,7 @@
             <w:tab/>
           </w:r>
           <w:r>
-            <w:t>31</w:t>
+            <w:t>35</w:t>
           </w:r>
         </w:p>
         <w:p>
@@ -532,7 +532,7 @@
             <w:tab/>
           </w:r>
           <w:r>
-            <w:t>33</w:t>
+            <w:t>37</w:t>
           </w:r>
         </w:p>
         <w:p>
@@ -546,7 +546,7 @@
             <w:tab/>
           </w:r>
           <w:r>
-            <w:t>34</w:t>
+            <w:t>38</w:t>
           </w:r>
         </w:p>
         <w:p>
@@ -560,7 +560,7 @@
             <w:tab/>
           </w:r>
           <w:r>
-            <w:t>35</w:t>
+            <w:t>39</w:t>
           </w:r>
         </w:p>
         <w:p>
@@ -574,7 +574,7 @@
             <w:tab/>
           </w:r>
           <w:r>
-            <w:t>37</w:t>
+            <w:t>41</w:t>
           </w:r>
         </w:p>
         <w:p>
@@ -588,7 +588,7 @@
             <w:tab/>
           </w:r>
           <w:r>
-            <w:t>37</w:t>
+            <w:t>42</w:t>
           </w:r>
         </w:p>
         <w:p>
@@ -602,7 +602,7 @@
             <w:tab/>
           </w:r>
           <w:r>
-            <w:t>37</w:t>
+            <w:t>42</w:t>
           </w:r>
         </w:p>
         <w:p>
@@ -616,7 +616,7 @@
             <w:tab/>
           </w:r>
           <w:r>
-            <w:t>38</w:t>
+            <w:t>43</w:t>
           </w:r>
         </w:p>
         <w:p>
@@ -630,7 +630,7 @@
             <w:tab/>
           </w:r>
           <w:r>
-            <w:t>39</w:t>
+            <w:t>44</w:t>
           </w:r>
         </w:p>
         <w:p>
@@ -644,7 +644,7 @@
             <w:tab/>
           </w:r>
           <w:r>
-            <w:t>40</w:t>
+            <w:t>45</w:t>
           </w:r>
         </w:p>
         <w:p>
@@ -658,7 +658,7 @@
             <w:tab/>
           </w:r>
           <w:r>
-            <w:t>42</w:t>
+            <w:t>47</w:t>
           </w:r>
         </w:p>
         <w:p>
@@ -672,7 +672,7 @@
             <w:tab/>
           </w:r>
           <w:r>
-            <w:t>42</w:t>
+            <w:t>48</w:t>
           </w:r>
         </w:p>
         <w:p>
@@ -686,7 +686,7 @@
             <w:tab/>
           </w:r>
           <w:r>
-            <w:t>43</w:t>
+            <w:t>49</w:t>
           </w:r>
         </w:p>
         <w:p>
@@ -700,7 +700,7 @@
             <w:tab/>
           </w:r>
           <w:r>
-            <w:t>45</w:t>
+            <w:t>51</w:t>
           </w:r>
         </w:p>
         <w:p>
@@ -755,7 +755,7 @@
             <w:tab/>
           </w:r>
           <w:r>
-            <w:t>12</w:t>
+            <w:t>13</w:t>
           </w:r>
         </w:p>
         <w:p>
@@ -769,7 +769,7 @@
             <w:tab/>
           </w:r>
           <w:r>
-            <w:t>12</w:t>
+            <w:t>14</w:t>
           </w:r>
         </w:p>
         <w:p>
@@ -783,7 +783,7 @@
             <w:tab/>
           </w:r>
           <w:r>
-            <w:t>29</w:t>
+            <w:t>33</w:t>
           </w:r>
         </w:p>
         <w:p>
@@ -797,7 +797,7 @@
             <w:tab/>
           </w:r>
           <w:r>
-            <w:t>30</w:t>
+            <w:t>34</w:t>
           </w:r>
         </w:p>
         <w:p>
@@ -811,7 +811,7 @@
             <w:tab/>
           </w:r>
           <w:r>
-            <w:t>31</w:t>
+            <w:t>35</w:t>
           </w:r>
         </w:p>
         <w:p>
@@ -825,7 +825,7 @@
             <w:tab/>
           </w:r>
           <w:r>
-            <w:t>32</w:t>
+            <w:t>36</w:t>
           </w:r>
         </w:p>
         <w:p>
@@ -839,7 +839,7 @@
             <w:tab/>
           </w:r>
           <w:r>
-            <w:t>33</w:t>
+            <w:t>37</w:t>
           </w:r>
         </w:p>
         <w:p>
@@ -853,7 +853,7 @@
             <w:tab/>
           </w:r>
           <w:r>
-            <w:t>34</w:t>
+            <w:t>38</w:t>
           </w:r>
         </w:p>
         <w:p>
@@ -867,7 +867,7 @@
             <w:tab/>
           </w:r>
           <w:r>
-            <w:t>35</w:t>
+            <w:t>39</w:t>
           </w:r>
         </w:p>
         <w:p>
@@ -922,7 +922,7 @@
             <w:tab/>
           </w:r>
           <w:r>
-            <w:t>29</w:t>
+            <w:t>33</w:t>
           </w:r>
         </w:p>
         <w:p>
@@ -936,7 +936,7 @@
             <w:tab/>
           </w:r>
           <w:r>
-            <w:t>30</w:t>
+            <w:t>34</w:t>
           </w:r>
         </w:p>
         <w:p>
@@ -950,7 +950,7 @@
             <w:tab/>
           </w:r>
           <w:r>
-            <w:t>31</w:t>
+            <w:t>35</w:t>
           </w:r>
         </w:p>
         <w:p>
@@ -964,7 +964,7 @@
             <w:tab/>
           </w:r>
           <w:r>
-            <w:t>32</w:t>
+            <w:t>36</w:t>
           </w:r>
         </w:p>
         <w:p>
@@ -978,7 +978,7 @@
             <w:tab/>
           </w:r>
           <w:r>
-            <w:t>33</w:t>
+            <w:t>37</w:t>
           </w:r>
         </w:p>
         <w:p>
@@ -1151,8 +1151,22 @@
     </w:p>
     <w:p>
       <w:pPr>
+        <w:spacing w:before="0" w:after="0" w:line="6400" w:lineRule="exact"/>
+      </w:pPr>
+    </w:p>
+    <w:p>
+      <w:pPr>
         <w:pStyle w:val="1"/>
-        <w:pageBreakBefore/>
+        <w:spacing w:before="0" w:after="0"/>
+        <w:jc w:val="center"/>
+        <w:sectPr>
+          <w:footerReference w:type="default" r:id="rId13"/>
+          <w:pgSz w:w="11906" w:h="16838"/>
+          <w:pgMar w:top="1440" w:right="1800" w:bottom="1440" w:left="1800" w:header="708" w:footer="708" w:gutter="0"/>
+          <w:pgNumType w:start="1"/>
+          <w:cols w:space="720"/>
+          <w:docGrid w:linePitch="360"/>
+        </w:sectPr>
       </w:pPr>
       <w:r>
         <w:t>CHAPTER ONE: INTRODUCTION</w:t>
@@ -2223,6 +2237,13 @@
       <w:pPr>
         <w:spacing w:after="160"/>
         <w:jc w:val="both"/>
+        <w:sectPr>
+          <w:footerReference w:type="default" r:id="rId13"/>
+          <w:pgSz w:w="11906" w:h="16838"/>
+          <w:pgMar w:top="1440" w:right="1800" w:bottom="1440" w:left="1800" w:header="708" w:footer="708" w:gutter="0"/>
+          <w:cols w:space="720"/>
+          <w:docGrid w:linePitch="360"/>
+        </w:sectPr>
       </w:pPr>
       <w:r>
         <w:rPr>
@@ -2237,8 +2258,21 @@
     </w:p>
     <w:p>
       <w:pPr>
+        <w:spacing w:before="0" w:after="0" w:line="6400" w:lineRule="exact"/>
+      </w:pPr>
+    </w:p>
+    <w:p>
+      <w:pPr>
         <w:pStyle w:val="1"/>
-        <w:pageBreakBefore/>
+        <w:spacing w:before="0" w:after="0"/>
+        <w:jc w:val="center"/>
+        <w:sectPr>
+          <w:footerReference w:type="default" r:id="rId13"/>
+          <w:pgSz w:w="11906" w:h="16838"/>
+          <w:pgMar w:top="1440" w:right="1800" w:bottom="1440" w:left="1800" w:header="708" w:footer="708" w:gutter="0"/>
+          <w:cols w:space="720"/>
+          <w:docGrid w:linePitch="360"/>
+        </w:sectPr>
       </w:pPr>
       <w:r>
         <w:t>CHAPTER TWO: LITERATURE REVIEW</w:t>
@@ -5618,6 +5652,13 @@
       <w:pPr>
         <w:spacing w:after="160"/>
         <w:jc w:val="both"/>
+        <w:sectPr>
+          <w:footerReference w:type="default" r:id="rId13"/>
+          <w:pgSz w:w="11906" w:h="16838"/>
+          <w:pgMar w:top="1440" w:right="1800" w:bottom="1440" w:left="1800" w:header="708" w:footer="708" w:gutter="0"/>
+          <w:cols w:space="720"/>
+          <w:docGrid w:linePitch="360"/>
+        </w:sectPr>
       </w:pPr>
       <w:r>
         <w:t xml:space="preserve">Taken together, these studies agree on the main risk factors but also show that screening practice in the Arab region is uneven. No published study was found that describes children with DDH in </w:t>
@@ -5641,8 +5682,21 @@
     </w:p>
     <w:p>
       <w:pPr>
+        <w:spacing w:before="0" w:after="0" w:line="6400" w:lineRule="exact"/>
+      </w:pPr>
+    </w:p>
+    <w:p>
+      <w:pPr>
         <w:pStyle w:val="1"/>
-        <w:pageBreakBefore/>
+        <w:spacing w:before="0" w:after="0"/>
+        <w:jc w:val="center"/>
+        <w:sectPr>
+          <w:footerReference w:type="default" r:id="rId13"/>
+          <w:pgSz w:w="11906" w:h="16838"/>
+          <w:pgMar w:top="1440" w:right="1800" w:bottom="1440" w:left="1800" w:header="708" w:footer="708" w:gutter="0"/>
+          <w:cols w:space="720"/>
+          <w:docGrid w:linePitch="360"/>
+        </w:sectPr>
       </w:pPr>
       <w:r>
         <w:t>CHAPTER THREE: METHODOLOGY</w:t>
@@ -6409,12 +6463,32 @@
     <w:p>
       <w:pPr>
         <w:spacing w:after="60"/>
+        <w:sectPr>
+          <w:footerReference w:type="default" r:id="rId13"/>
+          <w:pgSz w:w="11906" w:h="16838"/>
+          <w:pgMar w:top="1440" w:right="1800" w:bottom="1440" w:left="1800" w:header="708" w:footer="708" w:gutter="0"/>
+          <w:cols w:space="720"/>
+          <w:docGrid w:linePitch="360"/>
+        </w:sectPr>
+      </w:pPr>
+    </w:p>
+    <w:p>
+      <w:pPr>
+        <w:spacing w:before="0" w:after="0" w:line="6400" w:lineRule="exact"/>
       </w:pPr>
     </w:p>
     <w:p>
       <w:pPr>
         <w:pStyle w:val="1"/>
-        <w:pageBreakBefore/>
+        <w:spacing w:before="0" w:after="0"/>
+        <w:jc w:val="center"/>
+        <w:sectPr>
+          <w:footerReference w:type="default" r:id="rId13"/>
+          <w:pgSz w:w="11906" w:h="16838"/>
+          <w:pgMar w:top="1440" w:right="1800" w:bottom="1440" w:left="1800" w:header="708" w:footer="708" w:gutter="0"/>
+          <w:cols w:space="720"/>
+          <w:docGrid w:linePitch="360"/>
+        </w:sectPr>
       </w:pPr>
       <w:r>
         <w:t>CHAPTER FOUR: RESULTS</w:t>
@@ -11706,12 +11780,32 @@
     <w:p>
       <w:pPr>
         <w:spacing w:after="60"/>
+        <w:sectPr>
+          <w:footerReference w:type="default" r:id="rId13"/>
+          <w:pgSz w:w="11906" w:h="16838"/>
+          <w:pgMar w:top="1440" w:right="1800" w:bottom="1440" w:left="1800" w:header="708" w:footer="708" w:gutter="0"/>
+          <w:cols w:space="720"/>
+          <w:docGrid w:linePitch="360"/>
+        </w:sectPr>
+      </w:pPr>
+    </w:p>
+    <w:p>
+      <w:pPr>
+        <w:spacing w:before="0" w:after="0" w:line="6400" w:lineRule="exact"/>
       </w:pPr>
     </w:p>
     <w:p>
       <w:pPr>
         <w:pStyle w:val="1"/>
-        <w:pageBreakBefore/>
+        <w:spacing w:before="0" w:after="0"/>
+        <w:jc w:val="center"/>
+        <w:sectPr>
+          <w:footerReference w:type="default" r:id="rId13"/>
+          <w:pgSz w:w="11906" w:h="16838"/>
+          <w:pgMar w:top="1440" w:right="1800" w:bottom="1440" w:left="1800" w:header="708" w:footer="708" w:gutter="0"/>
+          <w:cols w:space="720"/>
+          <w:docGrid w:linePitch="360"/>
+        </w:sectPr>
       </w:pPr>
       <w:r>
         <w:t>CHAPTER FIVE: DISCUSSION</w:t>
@@ -12062,6 +12156,13 @@
       <w:pPr>
         <w:spacing w:after="160"/>
         <w:jc w:val="both"/>
+        <w:sectPr>
+          <w:footerReference w:type="default" r:id="rId13"/>
+          <w:pgSz w:w="11906" w:h="16838"/>
+          <w:pgMar w:top="1440" w:right="1800" w:bottom="1440" w:left="1800" w:header="708" w:footer="708" w:gutter="0"/>
+          <w:cols w:space="720"/>
+          <w:docGrid w:linePitch="360"/>
+        </w:sectPr>
       </w:pPr>
       <w:r>
         <w:t xml:space="preserve">DDH care involves obstetricians, </w:t>
@@ -12085,8 +12186,21 @@
     </w:p>
     <w:p>
       <w:pPr>
+        <w:spacing w:before="0" w:after="0" w:line="6400" w:lineRule="exact"/>
+      </w:pPr>
+    </w:p>
+    <w:p>
+      <w:pPr>
         <w:pStyle w:val="1"/>
-        <w:pageBreakBefore/>
+        <w:spacing w:before="0" w:after="0"/>
+        <w:jc w:val="center"/>
+        <w:sectPr>
+          <w:footerReference w:type="default" r:id="rId13"/>
+          <w:pgSz w:w="11906" w:h="16838"/>
+          <w:pgMar w:top="1440" w:right="1800" w:bottom="1440" w:left="1800" w:header="708" w:footer="708" w:gutter="0"/>
+          <w:cols w:space="720"/>
+          <w:docGrid w:linePitch="360"/>
+        </w:sectPr>
       </w:pPr>
       <w:r>
         <w:t>CHAPTER SIX: CONCLUSION AND RECOMMENDATIONS</w:t>
@@ -14392,7 +14506,6 @@
       <w:footerReference w:type="default" r:id="rId13"/>
       <w:pgSz w:w="11906" w:h="16838"/>
       <w:pgMar w:top="1440" w:right="1800" w:bottom="1440" w:left="1800" w:header="708" w:footer="708" w:gutter="0"/>
-      <w:pgNumType w:start="1"/>
       <w:cols w:space="720"/>
       <w:docGrid w:linePitch="360"/>
     </w:sectPr>

</xml_diff>